<commit_message>
Fix wrapped columns in screenshots and correct report details
- Widen the status column so MAINTENANCE no longer wraps (Figures 9, 42)
  and give date columns a compact width; re-captured all screenshots
- Correct the DEFAULT count (14, not 13)
- Say clearly that the red ORA- messages in the test figures are expected
- Reword the procedure-vs-function viva answer

Co-Authored-By: Claude Opus 5.5 <noreply@anthropic.com>
Claude-Session: https://claude.ai/code/session_01YVULFHd9Z5vNQ4W3qyWM67
</commit_message>
<xml_diff>
--- a/review2/Vehicle_Rental_Review2_Report.docx
+++ b/review2/Vehicle_Rental_Review2_Report.docx
@@ -1888,7 +1888,7 @@
                 <w:i w:val="0"/>
                 <w:sz w:val="18"/>
               </w:rPr>
-              <w:t>8 tables, 4 sequences; 8 PRIMARY KEY, 10 FOREIGN KEY, 10 UNIQUE, 23 CHECK, 34 NOT NULL constraints and 13 DEFAULT values. 8 constraint tests.</w:t>
+              <w:t>8 tables, 4 sequences; 8 PRIMARY KEY, 10 FOREIGN KEY, 10 UNIQUE, 23 CHECK, 34 NOT NULL constraints and 14 DEFAULT values. 8 constraint tests.</w:t>
             </w:r>
           </w:p>
         </w:tc>
@@ -6152,7 +6152,7 @@
                 <w:i w:val="0"/>
                 <w:sz w:val="17"/>
               </w:rPr>
-              <w:t>13</w:t>
+              <w:t>14</w:t>
             </w:r>
           </w:p>
         </w:tc>
@@ -7381,6 +7381,20 @@
         <w:keepNext w:val="0"/>
         <w:spacing w:before="0" w:after="40" w:line="144" w:lineRule="auto"/>
       </w:pPr>
+    </w:p>
+    <w:p>
+      <w:pPr>
+        <w:keepNext w:val="0"/>
+        <w:spacing w:before="0" w:after="80" w:line="264" w:lineRule="auto"/>
+      </w:pPr>
+      <w:r>
+        <w:rPr>
+          <w:b w:val="0"/>
+          <w:i w:val="0"/>
+          <w:sz w:val="20"/>
+        </w:rPr>
+        <w:t>The ORA- messages (shown in red) in Figures 6 and 7, and later in the trigger and business-rule tests, are expected results, not mistakes: each test is written to break one rule, and the error proves that Oracle refused the bad data.</w:t>
+      </w:r>
     </w:p>
     <w:p>
       <w:pPr>
@@ -8811,7 +8825,7 @@
       <w:r>
         <w:drawing>
           <wp:inline xmlns:a="http://schemas.openxmlformats.org/drawingml/2006/main" xmlns:pic="http://schemas.openxmlformats.org/drawingml/2006/picture">
-            <wp:extent cx="4031352" cy="2247192"/>
+            <wp:extent cx="4069583" cy="2085767"/>
             <wp:docPr id="9" name="Picture 9"/>
             <wp:cNvGraphicFramePr>
               <a:graphicFrameLocks noChangeAspect="1"/>
@@ -8832,7 +8846,7 @@
                   <pic:spPr>
                     <a:xfrm>
                       <a:off x="0" y="0"/>
-                      <a:ext cx="4031352" cy="2247192"/>
+                      <a:ext cx="4069583" cy="2085767"/>
                     </a:xfrm>
                     <a:prstGeom prst="rect"/>
                   </pic:spPr>
@@ -8877,7 +8891,7 @@
       <w:r>
         <w:drawing>
           <wp:inline xmlns:a="http://schemas.openxmlformats.org/drawingml/2006/main" xmlns:pic="http://schemas.openxmlformats.org/drawingml/2006/picture">
-            <wp:extent cx="5029632" cy="2812176"/>
+            <wp:extent cx="4375440" cy="2812176"/>
             <wp:docPr id="10" name="Picture 10"/>
             <wp:cNvGraphicFramePr>
               <a:graphicFrameLocks noChangeAspect="1"/>
@@ -8898,7 +8912,7 @@
                   <pic:spPr>
                     <a:xfrm>
                       <a:off x="0" y="0"/>
-                      <a:ext cx="5029632" cy="2812176"/>
+                      <a:ext cx="4375440" cy="2812176"/>
                     </a:xfrm>
                     <a:prstGeom prst="rect"/>
                   </pic:spPr>
@@ -10721,7 +10735,7 @@
       <w:r>
         <w:drawing>
           <wp:inline xmlns:a="http://schemas.openxmlformats.org/drawingml/2006/main" xmlns:pic="http://schemas.openxmlformats.org/drawingml/2006/picture">
-            <wp:extent cx="4451904" cy="1682208"/>
+            <wp:extent cx="4490136" cy="1682208"/>
             <wp:docPr id="22" name="Picture 22"/>
             <wp:cNvGraphicFramePr>
               <a:graphicFrameLocks noChangeAspect="1"/>
@@ -10742,7 +10756,7 @@
                   <pic:spPr>
                     <a:xfrm>
                       <a:off x="0" y="0"/>
-                      <a:ext cx="4451904" cy="1682208"/>
+                      <a:ext cx="4490136" cy="1682208"/>
                     </a:xfrm>
                     <a:prstGeom prst="rect"/>
                   </pic:spPr>
@@ -10844,7 +10858,7 @@
       <w:r>
         <w:drawing>
           <wp:inline xmlns:a="http://schemas.openxmlformats.org/drawingml/2006/main" xmlns:pic="http://schemas.openxmlformats.org/drawingml/2006/picture">
-            <wp:extent cx="4528368" cy="2085768"/>
+            <wp:extent cx="3954887" cy="2085767"/>
             <wp:docPr id="23" name="Picture 23"/>
             <wp:cNvGraphicFramePr>
               <a:graphicFrameLocks noChangeAspect="1"/>
@@ -10865,7 +10879,7 @@
                   <pic:spPr>
                     <a:xfrm>
                       <a:off x="0" y="0"/>
-                      <a:ext cx="4528368" cy="2085768"/>
+                      <a:ext cx="3954887" cy="2085767"/>
                     </a:xfrm>
                     <a:prstGeom prst="rect"/>
                   </pic:spPr>
@@ -11104,7 +11118,7 @@
       <w:r>
         <w:drawing>
           <wp:inline xmlns:a="http://schemas.openxmlformats.org/drawingml/2006/main" xmlns:pic="http://schemas.openxmlformats.org/drawingml/2006/picture">
-            <wp:extent cx="3840191" cy="1682208"/>
+            <wp:extent cx="3683015" cy="1682208"/>
             <wp:docPr id="25" name="Picture 25"/>
             <wp:cNvGraphicFramePr>
               <a:graphicFrameLocks noChangeAspect="1"/>
@@ -11125,7 +11139,7 @@
                   <pic:spPr>
                     <a:xfrm>
                       <a:off x="0" y="0"/>
-                      <a:ext cx="3840191" cy="1682208"/>
+                      <a:ext cx="3683015" cy="1682208"/>
                     </a:xfrm>
                     <a:prstGeom prst="rect"/>
                   </pic:spPr>
@@ -11610,7 +11624,7 @@
       <w:r>
         <w:drawing>
           <wp:inline xmlns:a="http://schemas.openxmlformats.org/drawingml/2006/main" xmlns:pic="http://schemas.openxmlformats.org/drawingml/2006/picture">
-            <wp:extent cx="3644784" cy="1278648"/>
+            <wp:extent cx="3300696" cy="1278648"/>
             <wp:docPr id="29" name="Picture 29"/>
             <wp:cNvGraphicFramePr>
               <a:graphicFrameLocks noChangeAspect="1"/>
@@ -11631,7 +11645,7 @@
                   <pic:spPr>
                     <a:xfrm>
                       <a:off x="0" y="0"/>
-                      <a:ext cx="3644784" cy="1278648"/>
+                      <a:ext cx="3300696" cy="1278648"/>
                     </a:xfrm>
                     <a:prstGeom prst="rect"/>
                   </pic:spPr>
@@ -13774,7 +13788,7 @@
       <w:r>
         <w:drawing>
           <wp:inline xmlns:a="http://schemas.openxmlformats.org/drawingml/2006/main" xmlns:pic="http://schemas.openxmlformats.org/drawingml/2006/picture">
-            <wp:extent cx="3954887" cy="1843632"/>
+            <wp:extent cx="3377160" cy="1843632"/>
             <wp:docPr id="31" name="Picture 31"/>
             <wp:cNvGraphicFramePr>
               <a:graphicFrameLocks noChangeAspect="1"/>
@@ -13795,7 +13809,7 @@
                   <pic:spPr>
                     <a:xfrm>
                       <a:off x="0" y="0"/>
-                      <a:ext cx="3954887" cy="1843632"/>
+                      <a:ext cx="3377160" cy="1843632"/>
                     </a:xfrm>
                     <a:prstGeom prst="rect"/>
                   </pic:spPr>
@@ -21051,7 +21065,7 @@
       <w:r>
         <w:drawing>
           <wp:inline xmlns:a="http://schemas.openxmlformats.org/drawingml/2006/main" xmlns:pic="http://schemas.openxmlformats.org/drawingml/2006/picture">
-            <wp:extent cx="4107816" cy="4829976"/>
+            <wp:extent cx="4107816" cy="4587840"/>
             <wp:docPr id="42" name="Picture 42"/>
             <wp:cNvGraphicFramePr>
               <a:graphicFrameLocks noChangeAspect="1"/>
@@ -21072,7 +21086,7 @@
                   <pic:spPr>
                     <a:xfrm>
                       <a:off x="0" y="0"/>
-                      <a:ext cx="4107816" cy="4829976"/>
+                      <a:ext cx="4107816" cy="4587840"/>
                     </a:xfrm>
                     <a:prstGeom prst="rect"/>
                   </pic:spPr>
@@ -24105,7 +24119,7 @@
                 <w:i w:val="0"/>
                 <w:sz w:val="17"/>
               </w:rPr>
-              <w:t>Functions return one value and are used in SQL (fn_calculate_rent in Q-style SELECTs). Procedures do a full operation and change data (sp_return_vehicle updates BOOKING and inserts PAYMENT rows).</w:t>
+              <w:t>Functions return one value and can be used inside a SELECT (fn_calculate_rent in Figure 31). Procedures do a full operation and change data (sp_return_vehicle updates BOOKING and inserts PAYMENT rows).</w:t>
             </w:r>
           </w:p>
         </w:tc>

</xml_diff>